<commit_message>
Correction des petites erreurs qu'il peut y avoir dans phpStorm
</commit_message>
<xml_diff>
--- a/Documents/Améliorations.docx
+++ b/Documents/Améliorations.docx
@@ -1,6 +1,6 @@
 
 <file path=word/document.xml><?xml version="1.0" encoding="utf-8"?>
-<w:document xmlns:wpc="http://schemas.microsoft.com/office/word/2010/wordprocessingCanvas" xmlns:cx="http://schemas.microsoft.com/office/drawing/2014/chartex" xmlns:cx1="http://schemas.microsoft.com/office/drawing/2015/9/8/chartex" xmlns:cx2="http://schemas.microsoft.com/office/drawing/2015/10/21/chartex" xmlns:cx3="http://schemas.microsoft.com/office/drawing/2016/5/9/chartex" xmlns:cx4="http://schemas.microsoft.com/office/drawing/2016/5/10/chartex" xmlns:cx5="http://schemas.microsoft.com/office/drawing/2016/5/11/chartex" xmlns:cx6="http://schemas.microsoft.com/office/drawing/2016/5/12/chartex" xmlns:cx7="http://schemas.microsoft.com/office/drawing/2016/5/13/chartex" xmlns:cx8="http://schemas.microsoft.com/office/drawing/2016/5/14/chartex" xmlns:mc="http://schemas.openxmlformats.org/markup-compatibility/2006" xmlns:aink="http://schemas.microsoft.com/office/drawing/2016/ink" xmlns:am3d="http://schemas.microsoft.com/office/drawing/2017/model3d" xmlns:o="urn:schemas-microsoft-com:office:office" xmlns:r="http://schemas.openxmlformats.org/officeDocument/2006/relationships" xmlns:m="http://schemas.openxmlformats.org/officeDocument/2006/math" xmlns:v="urn:schemas-microsoft-com:vml" xmlns:wp14="http://schemas.microsoft.com/office/word/2010/wordprocessingDrawing" xmlns:wp="http://schemas.openxmlformats.org/drawingml/2006/wordprocessingDrawing" xmlns:w10="urn:schemas-microsoft-com:office:word" xmlns:w="http://schemas.openxmlformats.org/wordprocessingml/2006/main" xmlns:w14="http://schemas.microsoft.com/office/word/2010/wordml" xmlns:w15="http://schemas.microsoft.com/office/word/2012/wordml" xmlns:w16cex="http://schemas.microsoft.com/office/word/2018/wordml/cex" xmlns:w16cid="http://schemas.microsoft.com/office/word/2016/wordml/cid" xmlns:w16="http://schemas.microsoft.com/office/word/2018/wordml" xmlns:w16sdtdh="http://schemas.microsoft.com/office/word/2020/wordml/sdtdatahash" xmlns:w16se="http://schemas.microsoft.com/office/word/2015/wordml/symex" xmlns:wpg="http://schemas.microsoft.com/office/word/2010/wordprocessingGroup" xmlns:wpi="http://schemas.microsoft.com/office/word/2010/wordprocessingInk" xmlns:wne="http://schemas.microsoft.com/office/word/2006/wordml" xmlns:wps="http://schemas.microsoft.com/office/word/2010/wordprocessingShape" mc:Ignorable="w14 w15 w16se w16cid w16 w16cex w16sdtdh wp14">
+<w:document xmlns:wpc="http://schemas.microsoft.com/office/word/2010/wordprocessingCanvas" xmlns:cx="http://schemas.microsoft.com/office/drawing/2014/chartex" xmlns:cx1="http://schemas.microsoft.com/office/drawing/2015/9/8/chartex" xmlns:cx2="http://schemas.microsoft.com/office/drawing/2015/10/21/chartex" xmlns:cx3="http://schemas.microsoft.com/office/drawing/2016/5/9/chartex" xmlns:cx4="http://schemas.microsoft.com/office/drawing/2016/5/10/chartex" xmlns:cx5="http://schemas.microsoft.com/office/drawing/2016/5/11/chartex" xmlns:cx6="http://schemas.microsoft.com/office/drawing/2016/5/12/chartex" xmlns:cx7="http://schemas.microsoft.com/office/drawing/2016/5/13/chartex" xmlns:cx8="http://schemas.microsoft.com/office/drawing/2016/5/14/chartex" xmlns:mc="http://schemas.openxmlformats.org/markup-compatibility/2006" xmlns:aink="http://schemas.microsoft.com/office/drawing/2016/ink" xmlns:am3d="http://schemas.microsoft.com/office/drawing/2017/model3d" xmlns:o="urn:schemas-microsoft-com:office:office" xmlns:oel="http://schemas.microsoft.com/office/2019/extlst" xmlns:r="http://schemas.openxmlformats.org/officeDocument/2006/relationships" xmlns:m="http://schemas.openxmlformats.org/officeDocument/2006/math" xmlns:v="urn:schemas-microsoft-com:vml" xmlns:wp14="http://schemas.microsoft.com/office/word/2010/wordprocessingDrawing" xmlns:wp="http://schemas.openxmlformats.org/drawingml/2006/wordprocessingDrawing" xmlns:w10="urn:schemas-microsoft-com:office:word" xmlns:w="http://schemas.openxmlformats.org/wordprocessingml/2006/main" xmlns:w14="http://schemas.microsoft.com/office/word/2010/wordml" xmlns:w15="http://schemas.microsoft.com/office/word/2012/wordml" xmlns:w16cex="http://schemas.microsoft.com/office/word/2018/wordml/cex" xmlns:w16cid="http://schemas.microsoft.com/office/word/2016/wordml/cid" xmlns:w16="http://schemas.microsoft.com/office/word/2018/wordml" xmlns:w16du="http://schemas.microsoft.com/office/word/2023/wordml/word16du" xmlns:w16sdtdh="http://schemas.microsoft.com/office/word/2020/wordml/sdtdatahash" xmlns:w16sdtfl="http://schemas.microsoft.com/office/word/2024/wordml/sdtformatlock" xmlns:w16se="http://schemas.microsoft.com/office/word/2015/wordml/symex" xmlns:wpg="http://schemas.microsoft.com/office/word/2010/wordprocessingGroup" xmlns:wpi="http://schemas.microsoft.com/office/word/2010/wordprocessingInk" xmlns:wne="http://schemas.microsoft.com/office/word/2006/wordml" xmlns:wps="http://schemas.microsoft.com/office/word/2010/wordprocessingShape" mc:Ignorable="w14 w15 w16se w16cid w16 w16cex w16sdtdh w16sdtfl w16du wp14">
   <w:body>
     <w:p>
       <w:pPr>
@@ -628,15 +628,7 @@
               <w:cnfStyle w:val="000000100000" w:firstRow="0" w:lastRow="0" w:firstColumn="0" w:lastColumn="0" w:oddVBand="0" w:evenVBand="0" w:oddHBand="1" w:evenHBand="0" w:firstRowFirstColumn="0" w:firstRowLastColumn="0" w:lastRowFirstColumn="0" w:lastRowLastColumn="0"/>
             </w:pPr>
             <w:r>
-              <w:t xml:space="preserve">Rendre </w:t>
-            </w:r>
-            <w:proofErr w:type="gramStart"/>
-            <w:r>
-              <w:t>accessibilité ouvert</w:t>
-            </w:r>
-            <w:proofErr w:type="gramEnd"/>
-            <w:r>
-              <w:t xml:space="preserve"> aux </w:t>
+              <w:t xml:space="preserve">Rendre accessibilité ouvert aux </w:t>
             </w:r>
             <w:proofErr w:type="spellStart"/>
             <w:r>
@@ -781,11 +773,9 @@
             <w:r>
               <w:t xml:space="preserve">Les utilisateurs </w:t>
             </w:r>
-            <w:proofErr w:type="gramStart"/>
-            <w:r>
-              <w:t>pourrait</w:t>
-            </w:r>
-            <w:proofErr w:type="gramEnd"/>
+            <w:r>
+              <w:t>pourraient</w:t>
+            </w:r>
             <w:r>
               <w:t xml:space="preserve"> laisser des commentaires ou avis sur une </w:t>
             </w:r>
@@ -890,7 +880,7 @@
 </file>
 
 <file path=word/numbering.xml><?xml version="1.0" encoding="utf-8"?>
-<w:numbering xmlns:wpc="http://schemas.microsoft.com/office/word/2010/wordprocessingCanvas" xmlns:cx="http://schemas.microsoft.com/office/drawing/2014/chartex" xmlns:cx1="http://schemas.microsoft.com/office/drawing/2015/9/8/chartex" xmlns:cx2="http://schemas.microsoft.com/office/drawing/2015/10/21/chartex" xmlns:cx3="http://schemas.microsoft.com/office/drawing/2016/5/9/chartex" xmlns:cx4="http://schemas.microsoft.com/office/drawing/2016/5/10/chartex" xmlns:cx5="http://schemas.microsoft.com/office/drawing/2016/5/11/chartex" xmlns:cx6="http://schemas.microsoft.com/office/drawing/2016/5/12/chartex" xmlns:cx7="http://schemas.microsoft.com/office/drawing/2016/5/13/chartex" xmlns:cx8="http://schemas.microsoft.com/office/drawing/2016/5/14/chartex" xmlns:mc="http://schemas.openxmlformats.org/markup-compatibility/2006" xmlns:aink="http://schemas.microsoft.com/office/drawing/2016/ink" xmlns:am3d="http://schemas.microsoft.com/office/drawing/2017/model3d" xmlns:o="urn:schemas-microsoft-com:office:office" xmlns:r="http://schemas.openxmlformats.org/officeDocument/2006/relationships" xmlns:m="http://schemas.openxmlformats.org/officeDocument/2006/math" xmlns:v="urn:schemas-microsoft-com:vml" xmlns:wp14="http://schemas.microsoft.com/office/word/2010/wordprocessingDrawing" xmlns:wp="http://schemas.openxmlformats.org/drawingml/2006/wordprocessingDrawing" xmlns:w10="urn:schemas-microsoft-com:office:word" xmlns:w="http://schemas.openxmlformats.org/wordprocessingml/2006/main" xmlns:w14="http://schemas.microsoft.com/office/word/2010/wordml" xmlns:w15="http://schemas.microsoft.com/office/word/2012/wordml" xmlns:w16cex="http://schemas.microsoft.com/office/word/2018/wordml/cex" xmlns:w16cid="http://schemas.microsoft.com/office/word/2016/wordml/cid" xmlns:w16="http://schemas.microsoft.com/office/word/2018/wordml" xmlns:w16sdtdh="http://schemas.microsoft.com/office/word/2020/wordml/sdtdatahash" xmlns:w16se="http://schemas.microsoft.com/office/word/2015/wordml/symex" xmlns:wpg="http://schemas.microsoft.com/office/word/2010/wordprocessingGroup" xmlns:wpi="http://schemas.microsoft.com/office/word/2010/wordprocessingInk" xmlns:wne="http://schemas.microsoft.com/office/word/2006/wordml" xmlns:wps="http://schemas.microsoft.com/office/word/2010/wordprocessingShape" mc:Ignorable="w14 w15 w16se w16cid w16 w16cex w16sdtdh wp14">
+<w:numbering xmlns:wpc="http://schemas.microsoft.com/office/word/2010/wordprocessingCanvas" xmlns:cx="http://schemas.microsoft.com/office/drawing/2014/chartex" xmlns:cx1="http://schemas.microsoft.com/office/drawing/2015/9/8/chartex" xmlns:cx2="http://schemas.microsoft.com/office/drawing/2015/10/21/chartex" xmlns:cx3="http://schemas.microsoft.com/office/drawing/2016/5/9/chartex" xmlns:cx4="http://schemas.microsoft.com/office/drawing/2016/5/10/chartex" xmlns:cx5="http://schemas.microsoft.com/office/drawing/2016/5/11/chartex" xmlns:cx6="http://schemas.microsoft.com/office/drawing/2016/5/12/chartex" xmlns:cx7="http://schemas.microsoft.com/office/drawing/2016/5/13/chartex" xmlns:cx8="http://schemas.microsoft.com/office/drawing/2016/5/14/chartex" xmlns:mc="http://schemas.openxmlformats.org/markup-compatibility/2006" xmlns:aink="http://schemas.microsoft.com/office/drawing/2016/ink" xmlns:am3d="http://schemas.microsoft.com/office/drawing/2017/model3d" xmlns:o="urn:schemas-microsoft-com:office:office" xmlns:oel="http://schemas.microsoft.com/office/2019/extlst" xmlns:r="http://schemas.openxmlformats.org/officeDocument/2006/relationships" xmlns:m="http://schemas.openxmlformats.org/officeDocument/2006/math" xmlns:v="urn:schemas-microsoft-com:vml" xmlns:wp14="http://schemas.microsoft.com/office/word/2010/wordprocessingDrawing" xmlns:wp="http://schemas.openxmlformats.org/drawingml/2006/wordprocessingDrawing" xmlns:w10="urn:schemas-microsoft-com:office:word" xmlns:w="http://schemas.openxmlformats.org/wordprocessingml/2006/main" xmlns:w14="http://schemas.microsoft.com/office/word/2010/wordml" xmlns:w15="http://schemas.microsoft.com/office/word/2012/wordml" xmlns:w16cex="http://schemas.microsoft.com/office/word/2018/wordml/cex" xmlns:w16cid="http://schemas.microsoft.com/office/word/2016/wordml/cid" xmlns:w16="http://schemas.microsoft.com/office/word/2018/wordml" xmlns:w16du="http://schemas.microsoft.com/office/word/2023/wordml/word16du" xmlns:w16sdtdh="http://schemas.microsoft.com/office/word/2020/wordml/sdtdatahash" xmlns:w16sdtfl="http://schemas.microsoft.com/office/word/2024/wordml/sdtformatlock" xmlns:w16se="http://schemas.microsoft.com/office/word/2015/wordml/symex" xmlns:wpg="http://schemas.microsoft.com/office/word/2010/wordprocessingGroup" xmlns:wpi="http://schemas.microsoft.com/office/word/2010/wordprocessingInk" xmlns:wne="http://schemas.microsoft.com/office/word/2006/wordml" xmlns:wps="http://schemas.microsoft.com/office/word/2010/wordprocessingShape" mc:Ignorable="w14 w15 w16se w16cid w16 w16cex w16sdtdh w16sdtfl w16du wp14">
   <w:abstractNum w:abstractNumId="0" w15:restartNumberingAfterBreak="0">
     <w:nsid w:val="06411987"/>
     <w:multiLevelType w:val="hybridMultilevel"/>
@@ -1569,29 +1559,29 @@
       </w:rPr>
     </w:lvl>
   </w:abstractNum>
-  <w:num w:numId="1">
+  <w:num w:numId="1" w16cid:durableId="2146583783">
     <w:abstractNumId w:val="3"/>
   </w:num>
-  <w:num w:numId="2">
+  <w:num w:numId="2" w16cid:durableId="428046597">
     <w:abstractNumId w:val="5"/>
   </w:num>
-  <w:num w:numId="3">
+  <w:num w:numId="3" w16cid:durableId="1638100132">
     <w:abstractNumId w:val="4"/>
   </w:num>
-  <w:num w:numId="4">
+  <w:num w:numId="4" w16cid:durableId="1820613597">
     <w:abstractNumId w:val="0"/>
   </w:num>
-  <w:num w:numId="5">
+  <w:num w:numId="5" w16cid:durableId="1208105242">
     <w:abstractNumId w:val="2"/>
   </w:num>
-  <w:num w:numId="6">
+  <w:num w:numId="6" w16cid:durableId="1873879836">
     <w:abstractNumId w:val="1"/>
   </w:num>
 </w:numbering>
 </file>
 
 <file path=word/styles.xml><?xml version="1.0" encoding="utf-8"?>
-<w:styles xmlns:mc="http://schemas.openxmlformats.org/markup-compatibility/2006" xmlns:r="http://schemas.openxmlformats.org/officeDocument/2006/relationships" xmlns:w="http://schemas.openxmlformats.org/wordprocessingml/2006/main" xmlns:w14="http://schemas.microsoft.com/office/word/2010/wordml" xmlns:w15="http://schemas.microsoft.com/office/word/2012/wordml" xmlns:w16cex="http://schemas.microsoft.com/office/word/2018/wordml/cex" xmlns:w16cid="http://schemas.microsoft.com/office/word/2016/wordml/cid" xmlns:w16="http://schemas.microsoft.com/office/word/2018/wordml" xmlns:w16sdtdh="http://schemas.microsoft.com/office/word/2020/wordml/sdtdatahash" xmlns:w16se="http://schemas.microsoft.com/office/word/2015/wordml/symex" mc:Ignorable="w14 w15 w16se w16cid w16 w16cex w16sdtdh">
+<w:styles xmlns:mc="http://schemas.openxmlformats.org/markup-compatibility/2006" xmlns:r="http://schemas.openxmlformats.org/officeDocument/2006/relationships" xmlns:w="http://schemas.openxmlformats.org/wordprocessingml/2006/main" xmlns:w14="http://schemas.microsoft.com/office/word/2010/wordml" xmlns:w15="http://schemas.microsoft.com/office/word/2012/wordml" xmlns:w16cex="http://schemas.microsoft.com/office/word/2018/wordml/cex" xmlns:w16cid="http://schemas.microsoft.com/office/word/2016/wordml/cid" xmlns:w16="http://schemas.microsoft.com/office/word/2018/wordml" xmlns:w16du="http://schemas.microsoft.com/office/word/2023/wordml/word16du" xmlns:w16sdtdh="http://schemas.microsoft.com/office/word/2020/wordml/sdtdatahash" xmlns:w16sdtfl="http://schemas.microsoft.com/office/word/2024/wordml/sdtformatlock" xmlns:w16se="http://schemas.microsoft.com/office/word/2015/wordml/symex" mc:Ignorable="w14 w15 w16se w16cid w16 w16cex w16sdtdh w16sdtfl w16du">
   <w:docDefaults>
     <w:rPrDefault>
       <w:rPr>

</xml_diff>

<commit_message>
légère modif en attente de Sasha
</commit_message>
<xml_diff>
--- a/Documents/Améliorations.docx
+++ b/Documents/Améliorations.docx
@@ -155,7 +155,16 @@
               <w:cnfStyle w:val="000000000000" w:firstRow="0" w:lastRow="0" w:firstColumn="0" w:lastColumn="0" w:oddVBand="0" w:evenVBand="0" w:oddHBand="0" w:evenHBand="0" w:firstRowFirstColumn="0" w:firstRowLastColumn="0" w:lastRowFirstColumn="0" w:lastRowLastColumn="0"/>
             </w:pPr>
             <w:r>
-              <w:t>Faire une page fonctionnelle</w:t>
+              <w:t xml:space="preserve">Faire </w:t>
+            </w:r>
+            <w:r>
+              <w:t>en sorte que la</w:t>
+            </w:r>
+            <w:r>
+              <w:t xml:space="preserve"> page fonctionn</w:t>
+            </w:r>
+            <w:r>
+              <w:t>e de nouveau.</w:t>
             </w:r>
           </w:p>
         </w:tc>
@@ -183,6 +192,20 @@
             <w:pPr>
               <w:cnfStyle w:val="000000100000" w:firstRow="0" w:lastRow="0" w:firstColumn="0" w:lastColumn="0" w:oddVBand="0" w:evenVBand="0" w:oddHBand="1" w:evenHBand="0" w:firstRowFirstColumn="0" w:firstRowLastColumn="0" w:lastRowFirstColumn="0" w:lastRowLastColumn="0"/>
             </w:pPr>
+            <w:r>
+              <w:t xml:space="preserve">Les lieux favoris nous redirige sur la carte d’OSM et pas google </w:t>
+            </w:r>
+            <w:proofErr w:type="spellStart"/>
+            <w:r>
+              <w:t>map</w:t>
+            </w:r>
+            <w:r>
+              <w:t>s</w:t>
+            </w:r>
+            <w:proofErr w:type="spellEnd"/>
+            <w:r>
+              <w:t>.</w:t>
+            </w:r>
           </w:p>
         </w:tc>
       </w:tr>
@@ -206,6 +229,9 @@
             <w:pPr>
               <w:cnfStyle w:val="000000000000" w:firstRow="0" w:lastRow="0" w:firstColumn="0" w:lastColumn="0" w:oddVBand="0" w:evenVBand="0" w:oddHBand="0" w:evenHBand="0" w:firstRowFirstColumn="0" w:firstRowLastColumn="0" w:lastRowFirstColumn="0" w:lastRowLastColumn="0"/>
             </w:pPr>
+            <w:r>
+              <w:t>S’assurer que notre utilisation des données respecte le RGPD.</w:t>
+            </w:r>
           </w:p>
         </w:tc>
       </w:tr>
@@ -258,6 +284,9 @@
             <w:pPr>
               <w:cnfStyle w:val="000000000000" w:firstRow="0" w:lastRow="0" w:firstColumn="0" w:lastColumn="0" w:oddVBand="0" w:evenVBand="0" w:oddHBand="0" w:evenHBand="0" w:firstRowFirstColumn="0" w:firstRowLastColumn="0" w:lastRowFirstColumn="0" w:lastRowLastColumn="0"/>
             </w:pPr>
+            <w:r>
+              <w:t>Rendre l’architecture du site optimiser pour une plus grande efficacité.</w:t>
+            </w:r>
           </w:p>
         </w:tc>
       </w:tr>
@@ -310,6 +339,9 @@
             <w:pPr>
               <w:cnfStyle w:val="000000000000" w:firstRow="0" w:lastRow="0" w:firstColumn="0" w:lastColumn="0" w:oddVBand="0" w:evenVBand="0" w:oddHBand="0" w:evenHBand="0" w:firstRowFirstColumn="0" w:firstRowLastColumn="0" w:lastRowFirstColumn="0" w:lastRowLastColumn="0"/>
             </w:pPr>
+            <w:r>
+              <w:t>Réaliser des test pour vérifier que le code est sans faille.</w:t>
+            </w:r>
           </w:p>
         </w:tc>
       </w:tr>
@@ -680,13 +712,33 @@
               <w:cnfStyle w:val="000000000000" w:firstRow="0" w:lastRow="0" w:firstColumn="0" w:lastColumn="0" w:oddVBand="0" w:evenVBand="0" w:oddHBand="0" w:evenHBand="0" w:firstRowFirstColumn="0" w:firstRowLastColumn="0" w:lastRowFirstColumn="0" w:lastRowLastColumn="0"/>
             </w:pPr>
             <w:r>
-              <w:t xml:space="preserve">Ajouter profil à « mes </w:t>
+              <w:t xml:space="preserve">Ajouter </w:t>
+            </w:r>
+            <w:r>
+              <w:t xml:space="preserve">le </w:t>
             </w:r>
             <w:proofErr w:type="spellStart"/>
             <w:r>
+              <w:t>aside</w:t>
+            </w:r>
+            <w:proofErr w:type="spellEnd"/>
+            <w:r>
+              <w:t xml:space="preserve"> de </w:t>
+            </w:r>
+            <w:r>
+              <w:t xml:space="preserve">profil à « mes </w:t>
+            </w:r>
+            <w:proofErr w:type="spellStart"/>
+            <w:r>
               <w:t>roadTrip</w:t>
             </w:r>
             <w:proofErr w:type="spellEnd"/>
+            <w:r>
+              <w:t> »</w:t>
+            </w:r>
+            <w:r>
+              <w:t>.</w:t>
+            </w:r>
           </w:p>
         </w:tc>
       </w:tr>
@@ -787,12 +839,16 @@
             <w:r>
               <w:t xml:space="preserve"> ou lieux</w:t>
             </w:r>
+            <w:r>
+              <w:t>.</w:t>
+            </w:r>
           </w:p>
         </w:tc>
       </w:tr>
       <w:tr>
         <w:trPr>
           <w:cnfStyle w:val="000000100000" w:firstRow="0" w:lastRow="0" w:firstColumn="0" w:lastColumn="0" w:oddVBand="0" w:evenVBand="0" w:oddHBand="1" w:evenHBand="0" w:firstRowFirstColumn="0" w:firstRowLastColumn="0" w:lastRowFirstColumn="0" w:lastRowLastColumn="0"/>
+          <w:trHeight w:val="332"/>
         </w:trPr>
         <w:tc>
           <w:tcPr>
@@ -828,6 +884,9 @@
         </w:tc>
       </w:tr>
       <w:tr>
+        <w:trPr>
+          <w:trHeight w:val="354"/>
+        </w:trPr>
         <w:tc>
           <w:tcPr>
             <w:cnfStyle w:val="001000000000" w:firstRow="0" w:lastRow="0" w:firstColumn="1" w:lastColumn="0" w:oddVBand="0" w:evenVBand="0" w:oddHBand="0" w:evenHBand="0" w:firstRowFirstColumn="0" w:firstRowLastColumn="0" w:lastRowFirstColumn="0" w:lastRowLastColumn="0"/>
@@ -853,7 +912,15 @@
               <w:cnfStyle w:val="000000000000" w:firstRow="0" w:lastRow="0" w:firstColumn="0" w:lastColumn="0" w:oddVBand="0" w:evenVBand="0" w:oddHBand="0" w:evenHBand="0" w:firstRowFirstColumn="0" w:firstRowLastColumn="0" w:lastRowFirstColumn="0" w:lastRowLastColumn="0"/>
             </w:pPr>
             <w:r>
-              <w:t>Afin de renforcer la sécurité</w:t>
+              <w:t xml:space="preserve">Le </w:t>
+            </w:r>
+            <w:proofErr w:type="spellStart"/>
+            <w:r>
+              <w:t>webroot</w:t>
+            </w:r>
+            <w:proofErr w:type="spellEnd"/>
+            <w:r>
+              <w:t xml:space="preserve"> est un dossier qui garderais les données importantes loin de la page directement accessible par le navigateur.</w:t>
             </w:r>
           </w:p>
         </w:tc>

</xml_diff>

<commit_message>
Petite modif du dossier d'Amélioration
</commit_message>
<xml_diff>
--- a/Documents/Améliorations.docx
+++ b/Documents/Améliorations.docx
@@ -66,15 +66,7 @@
               </w:rPr>
             </w:pPr>
             <w:r>
-              <w:t xml:space="preserve">Interface création de </w:t>
-            </w:r>
-            <w:proofErr w:type="spellStart"/>
-            <w:r>
-              <w:t>RoadTrip</w:t>
-            </w:r>
-            <w:proofErr w:type="spellEnd"/>
-            <w:r>
-              <w:t xml:space="preserve"> </w:t>
+              <w:t xml:space="preserve">Interface création de RoadTrip </w:t>
             </w:r>
           </w:p>
         </w:tc>
@@ -118,15 +110,7 @@
               <w:cnfStyle w:val="000000100000" w:firstRow="0" w:lastRow="0" w:firstColumn="0" w:lastColumn="0" w:oddVBand="0" w:evenVBand="0" w:oddHBand="1" w:evenHBand="0" w:firstRowFirstColumn="0" w:firstRowLastColumn="0" w:lastRowFirstColumn="0" w:lastRowLastColumn="0"/>
             </w:pPr>
             <w:r>
-              <w:t xml:space="preserve">Optimiser le </w:t>
-            </w:r>
-            <w:proofErr w:type="spellStart"/>
-            <w:r>
-              <w:t>chargment</w:t>
-            </w:r>
-            <w:proofErr w:type="spellEnd"/>
-            <w:r>
-              <w:t xml:space="preserve"> des données</w:t>
+              <w:t>Optimiser le chargment des données</w:t>
             </w:r>
           </w:p>
         </w:tc>
@@ -193,18 +177,10 @@
               <w:cnfStyle w:val="000000100000" w:firstRow="0" w:lastRow="0" w:firstColumn="0" w:lastColumn="0" w:oddVBand="0" w:evenVBand="0" w:oddHBand="1" w:evenHBand="0" w:firstRowFirstColumn="0" w:firstRowLastColumn="0" w:lastRowFirstColumn="0" w:lastRowLastColumn="0"/>
             </w:pPr>
             <w:r>
-              <w:t xml:space="preserve">Les lieux favoris nous redirige sur la carte d’OSM et pas google </w:t>
-            </w:r>
-            <w:proofErr w:type="spellStart"/>
-            <w:r>
-              <w:t>map</w:t>
-            </w:r>
-            <w:r>
-              <w:t>s</w:t>
-            </w:r>
-            <w:proofErr w:type="spellEnd"/>
-            <w:r>
-              <w:t>.</w:t>
+              <w:t>Les lieux favoris nous redirige sur la carte d’OSM et pas google map</w:t>
+            </w:r>
+            <w:r>
+              <w:t>s.</w:t>
             </w:r>
           </w:p>
         </w:tc>
@@ -460,15 +436,7 @@
               <w:cnfStyle w:val="000000100000" w:firstRow="0" w:lastRow="0" w:firstColumn="0" w:lastColumn="0" w:oddVBand="0" w:evenVBand="0" w:oddHBand="1" w:evenHBand="0" w:firstRowFirstColumn="0" w:firstRowLastColumn="0" w:lastRowFirstColumn="0" w:lastRowLastColumn="0"/>
             </w:pPr>
             <w:r>
-              <w:t xml:space="preserve">Rediriger vers </w:t>
-            </w:r>
-            <w:proofErr w:type="spellStart"/>
-            <w:r>
-              <w:t>trips&amp;roads</w:t>
-            </w:r>
-            <w:proofErr w:type="spellEnd"/>
-            <w:r>
-              <w:t xml:space="preserve"> </w:t>
+              <w:t xml:space="preserve">Rediriger vers trips&amp;roads </w:t>
             </w:r>
           </w:p>
         </w:tc>
@@ -528,15 +496,7 @@
           </w:tcPr>
           <w:p>
             <w:r>
-              <w:t xml:space="preserve">Format </w:t>
-            </w:r>
-            <w:proofErr w:type="spellStart"/>
-            <w:r>
-              <w:t>pdf</w:t>
-            </w:r>
-            <w:proofErr w:type="spellEnd"/>
-            <w:r>
-              <w:t xml:space="preserve"> </w:t>
+              <w:t xml:space="preserve">Format pdf </w:t>
             </w:r>
           </w:p>
         </w:tc>
@@ -549,15 +509,7 @@
               <w:cnfStyle w:val="000000100000" w:firstRow="0" w:lastRow="0" w:firstColumn="0" w:lastColumn="0" w:oddVBand="0" w:evenVBand="0" w:oddHBand="1" w:evenHBand="0" w:firstRowFirstColumn="0" w:firstRowLastColumn="0" w:lastRowFirstColumn="0" w:lastRowLastColumn="0"/>
             </w:pPr>
             <w:r>
-              <w:t xml:space="preserve">Créer une fonction export </w:t>
-            </w:r>
-            <w:proofErr w:type="spellStart"/>
-            <w:r>
-              <w:t>pdf</w:t>
-            </w:r>
-            <w:proofErr w:type="spellEnd"/>
-            <w:r>
-              <w:t xml:space="preserve"> (hors ligne)</w:t>
+              <w:t>Créer une fonction export pdf (hors ligne)</w:t>
             </w:r>
           </w:p>
         </w:tc>
@@ -570,15 +522,7 @@
           </w:tcPr>
           <w:p>
             <w:r>
-              <w:t xml:space="preserve">Enregistrer </w:t>
-            </w:r>
-            <w:proofErr w:type="spellStart"/>
-            <w:r>
-              <w:t>roadTrip</w:t>
-            </w:r>
-            <w:proofErr w:type="spellEnd"/>
-            <w:r>
-              <w:t xml:space="preserve"> étranger</w:t>
+              <w:t>Enregistrer roadTrip étranger</w:t>
             </w:r>
           </w:p>
         </w:tc>
@@ -591,15 +535,7 @@
               <w:cnfStyle w:val="000000000000" w:firstRow="0" w:lastRow="0" w:firstColumn="0" w:lastColumn="0" w:oddVBand="0" w:evenVBand="0" w:oddHBand="0" w:evenHBand="0" w:firstRowFirstColumn="0" w:firstRowLastColumn="0" w:lastRowFirstColumn="0" w:lastRowLastColumn="0"/>
             </w:pPr>
             <w:r>
-              <w:t xml:space="preserve">Pouvoir récupérer un </w:t>
-            </w:r>
-            <w:proofErr w:type="spellStart"/>
-            <w:r>
-              <w:t>roadTrip</w:t>
-            </w:r>
-            <w:proofErr w:type="spellEnd"/>
-            <w:r>
-              <w:t xml:space="preserve"> </w:t>
+              <w:t xml:space="preserve">Pouvoir récupérer un roadTrip </w:t>
             </w:r>
             <w:r>
               <w:t>public</w:t>
@@ -639,15 +575,7 @@
               <w:cnfStyle w:val="000000100000" w:firstRow="0" w:lastRow="0" w:firstColumn="0" w:lastColumn="0" w:oddVBand="0" w:evenVBand="0" w:oddHBand="1" w:evenHBand="0" w:firstRowFirstColumn="0" w:firstRowLastColumn="0" w:lastRowFirstColumn="0" w:lastRowLastColumn="0"/>
             </w:pPr>
             <w:r>
-              <w:t xml:space="preserve">Unifier </w:t>
-            </w:r>
-            <w:proofErr w:type="spellStart"/>
-            <w:r>
-              <w:t>boutton</w:t>
-            </w:r>
-            <w:proofErr w:type="spellEnd"/>
-            <w:r>
-              <w:t xml:space="preserve"> </w:t>
+              <w:t xml:space="preserve">Unifier boutton </w:t>
             </w:r>
           </w:p>
           <w:p>
@@ -660,13 +588,8 @@
               <w:cnfStyle w:val="000000100000" w:firstRow="0" w:lastRow="0" w:firstColumn="0" w:lastColumn="0" w:oddVBand="0" w:evenVBand="0" w:oddHBand="1" w:evenHBand="0" w:firstRowFirstColumn="0" w:firstRowLastColumn="0" w:lastRowFirstColumn="0" w:lastRowLastColumn="0"/>
             </w:pPr>
             <w:r>
-              <w:t xml:space="preserve">Rendre accessibilité ouvert aux </w:t>
-            </w:r>
-            <w:proofErr w:type="spellStart"/>
-            <w:r>
-              <w:t>visiteus</w:t>
-            </w:r>
-            <w:proofErr w:type="spellEnd"/>
+              <w:t>Rendre accessibilité ouvert aux visiteus</w:t>
+            </w:r>
           </w:p>
           <w:p>
             <w:pPr>
@@ -678,15 +601,7 @@
               <w:cnfStyle w:val="000000100000" w:firstRow="0" w:lastRow="0" w:firstColumn="0" w:lastColumn="0" w:oddVBand="0" w:evenVBand="0" w:oddHBand="1" w:evenHBand="0" w:firstRowFirstColumn="0" w:firstRowLastColumn="0" w:lastRowFirstColumn="0" w:lastRowLastColumn="0"/>
             </w:pPr>
             <w:r>
-              <w:t xml:space="preserve">Visualisation </w:t>
-            </w:r>
-            <w:proofErr w:type="spellStart"/>
-            <w:r>
-              <w:t>roadtrip</w:t>
-            </w:r>
-            <w:proofErr w:type="spellEnd"/>
-            <w:r>
-              <w:t xml:space="preserve"> </w:t>
+              <w:t xml:space="preserve">Visualisation roadtrip </w:t>
             </w:r>
           </w:p>
         </w:tc>
@@ -715,24 +630,11 @@
               <w:t xml:space="preserve">Ajouter </w:t>
             </w:r>
             <w:r>
-              <w:t xml:space="preserve">le </w:t>
-            </w:r>
-            <w:proofErr w:type="spellStart"/>
-            <w:r>
-              <w:t>aside</w:t>
-            </w:r>
-            <w:proofErr w:type="spellEnd"/>
-            <w:r>
-              <w:t xml:space="preserve"> de </w:t>
-            </w:r>
-            <w:r>
-              <w:t xml:space="preserve">profil à « mes </w:t>
-            </w:r>
-            <w:proofErr w:type="spellStart"/>
-            <w:r>
-              <w:t>roadTrip</w:t>
-            </w:r>
-            <w:proofErr w:type="spellEnd"/>
+              <w:t xml:space="preserve">le aside de </w:t>
+            </w:r>
+            <w:r>
+              <w:t>profil à « mes roadTrip</w:t>
+            </w:r>
             <w:r>
               <w:t> »</w:t>
             </w:r>
@@ -770,21 +672,8 @@
               </w:numPr>
               <w:cnfStyle w:val="000000100000" w:firstRow="0" w:lastRow="0" w:firstColumn="0" w:lastColumn="0" w:oddVBand="0" w:evenVBand="0" w:oddHBand="1" w:evenHBand="0" w:firstRowFirstColumn="0" w:firstRowLastColumn="0" w:lastRowFirstColumn="0" w:lastRowLastColumn="0"/>
             </w:pPr>
-            <w:proofErr w:type="spellStart"/>
-            <w:r>
-              <w:t>L’ia</w:t>
-            </w:r>
-            <w:proofErr w:type="spellEnd"/>
-            <w:r>
-              <w:t xml:space="preserve"> aurait pour but de faciliter la création du </w:t>
-            </w:r>
-            <w:proofErr w:type="spellStart"/>
-            <w:r>
-              <w:t>roadtrip</w:t>
-            </w:r>
-            <w:proofErr w:type="spellEnd"/>
-            <w:r>
-              <w:t xml:space="preserve"> pour l’utilisateur</w:t>
+            <w:r>
+              <w:t>L’ia aurait pour but de faciliter la création du roadtrip pour l’utilisateur</w:t>
             </w:r>
           </w:p>
           <w:p>
@@ -829,15 +718,7 @@
               <w:t>pourraient</w:t>
             </w:r>
             <w:r>
-              <w:t xml:space="preserve"> laisser des commentaires ou avis sur une </w:t>
-            </w:r>
-            <w:proofErr w:type="spellStart"/>
-            <w:r>
-              <w:t>roadtrip</w:t>
-            </w:r>
-            <w:proofErr w:type="spellEnd"/>
-            <w:r>
-              <w:t xml:space="preserve"> ou lieux</w:t>
+              <w:t xml:space="preserve"> laisser des commentaires ou avis sur une roadtrip ou lieux</w:t>
             </w:r>
             <w:r>
               <w:t>.</w:t>
@@ -870,15 +751,7 @@
               <w:cnfStyle w:val="000000100000" w:firstRow="0" w:lastRow="0" w:firstColumn="0" w:lastColumn="0" w:oddVBand="0" w:evenVBand="0" w:oddHBand="1" w:evenHBand="0" w:firstRowFirstColumn="0" w:firstRowLastColumn="0" w:lastRowFirstColumn="0" w:lastRowLastColumn="0"/>
             </w:pPr>
             <w:r>
-              <w:t xml:space="preserve">L’utilisateurs aurait la possibilité de faire des </w:t>
-            </w:r>
-            <w:proofErr w:type="spellStart"/>
-            <w:r>
-              <w:t>posts</w:t>
-            </w:r>
-            <w:proofErr w:type="spellEnd"/>
-            <w:r>
-              <w:t xml:space="preserve"> type articles pour présenter ses idées.</w:t>
+              <w:t>L’utilisateurs aurait la possibilité de faire des posts type articles pour présenter ses idées.</w:t>
             </w:r>
           </w:p>
         </w:tc>
@@ -894,13 +767,8 @@
           </w:tcPr>
           <w:p>
             <w:r>
-              <w:t xml:space="preserve">Implémenter </w:t>
-            </w:r>
-            <w:proofErr w:type="spellStart"/>
-            <w:r>
-              <w:t>webroot</w:t>
-            </w:r>
-            <w:proofErr w:type="spellEnd"/>
+              <w:t>Implémenter webroot</w:t>
+            </w:r>
           </w:p>
         </w:tc>
         <w:tc>
@@ -912,15 +780,37 @@
               <w:cnfStyle w:val="000000000000" w:firstRow="0" w:lastRow="0" w:firstColumn="0" w:lastColumn="0" w:oddVBand="0" w:evenVBand="0" w:oddHBand="0" w:evenHBand="0" w:firstRowFirstColumn="0" w:firstRowLastColumn="0" w:lastRowFirstColumn="0" w:lastRowLastColumn="0"/>
             </w:pPr>
             <w:r>
-              <w:t xml:space="preserve">Le </w:t>
-            </w:r>
-            <w:proofErr w:type="spellStart"/>
-            <w:r>
-              <w:t>webroot</w:t>
-            </w:r>
-            <w:proofErr w:type="spellEnd"/>
-            <w:r>
-              <w:t xml:space="preserve"> est un dossier qui garderais les données importantes loin de la page directement accessible par le navigateur.</w:t>
+              <w:t>Le webroot est un dossier qui garderais les données importantes loin de la page directement accessible par le navigateur.</w:t>
+            </w:r>
+          </w:p>
+        </w:tc>
+      </w:tr>
+      <w:tr>
+        <w:trPr>
+          <w:cnfStyle w:val="000000100000" w:firstRow="0" w:lastRow="0" w:firstColumn="0" w:lastColumn="0" w:oddVBand="0" w:evenVBand="0" w:oddHBand="1" w:evenHBand="0" w:firstRowFirstColumn="0" w:firstRowLastColumn="0" w:lastRowFirstColumn="0" w:lastRowLastColumn="0"/>
+          <w:trHeight w:val="354"/>
+        </w:trPr>
+        <w:tc>
+          <w:tcPr>
+            <w:cnfStyle w:val="001000000000" w:firstRow="0" w:lastRow="0" w:firstColumn="1" w:lastColumn="0" w:oddVBand="0" w:evenVBand="0" w:oddHBand="0" w:evenHBand="0" w:firstRowFirstColumn="0" w:firstRowLastColumn="0" w:lastRowFirstColumn="0" w:lastRowLastColumn="0"/>
+            <w:tcW w:w="3397" w:type="dxa"/>
+          </w:tcPr>
+          <w:p>
+            <w:r>
+              <w:t xml:space="preserve">Refaire le site avec CakePHP </w:t>
+            </w:r>
+          </w:p>
+        </w:tc>
+        <w:tc>
+          <w:tcPr>
+            <w:tcW w:w="6521" w:type="dxa"/>
+          </w:tcPr>
+          <w:p>
+            <w:pPr>
+              <w:cnfStyle w:val="000000100000" w:firstRow="0" w:lastRow="0" w:firstColumn="0" w:lastColumn="0" w:oddVBand="0" w:evenVBand="0" w:oddHBand="1" w:evenHBand="0" w:firstRowFirstColumn="0" w:firstRowLastColumn="0" w:lastRowFirstColumn="0" w:lastRowLastColumn="0"/>
+            </w:pPr>
+            <w:r>
+              <w:t>L’archi webroot c’est bien mais a terme, le but est de passer notre site sous le framework CakePHP comme vu en cours pour une architecture sur le modèle MVC vraiment bien implémenté.</w:t>
             </w:r>
           </w:p>
         </w:tc>

</xml_diff>